<commit_message>
docs: standardize project title strictly to HE THONG QUAN LY SINH VIEN
</commit_message>
<xml_diff>
--- a/BAO_CAO_DO_AN_TRIEN_KHAI_VA_QUAN_TRI_HE_THONG_PHAN_MEM.docx
+++ b/BAO_CAO_DO_AN_TRIEN_KHAI_VA_QUAN_TRI_HE_THONG_PHAN_MEM.docx
@@ -61,13 +61,11 @@
         <w:rPr>
           <w:b/>
           <w:color w:val="1F4E79"/>
-          <w:sz w:val="36"/>
+          <w:sz w:val="40"/>
         </w:rPr>
         <w:t>ĐỀ TÀI:</w:t>
         <w:br/>
-        <w:t>TRIỂN KHAI VÀ QUẢN TRỊ HỆ THỐNG QUẢN LÝ SINH VIÊN</w:t>
-        <w:br/>
-        <w:t>TRÊN NỀN TẢNG CONTAINER DOCKER</w:t>
+        <w:t>HỆ THỐNG QUẢN LÝ SINH VIÊN</w:t>
       </w:r>
     </w:p>
     <w:p/>
@@ -362,7 +360,7 @@
     </w:p>
     <w:p>
       <w:r>
-        <w:t>Đặc biệt, em xin bày tỏ lòng biết ơn sâu sắc nhất tới thầy Vũ Văn Diện, người đã trực tiếp truyền đạt những kiến thức nền tảng quý báu về quản trị hệ thống, kiến trúc container và luôn tận tình hướng dẫn, định hướng cho em trong suốt quá trình thực hiện đề tài 'Triển khai và quản trị hệ thống quản lý sinh viên trên nền tảng Container Docker'.</w:t>
+        <w:t>Đặc biệt, em xin bày tỏ lòng biết ơn sâu sắc nhất tới thầy Vũ Văn Diện, người đã trực tiếp truyền đạt những kiến thức nền tảng quý báu về quản trị hệ thống, kiến trúc container và luôn tận tình hướng dẫn, định hướng cho em trong suốt quá trình thực hiện đề tài 'Hệ thống Quản lý Sinh viên'.</w:t>
       </w:r>
     </w:p>
     <w:p>

</xml_diff>